<commit_message>
ca6 answering-brief, opening-brief docx: the typst faces via docx/reference.xml (TeX Gyre Schola 14 pt answering, Liberation Serif 14 pt opening; make-reference.sh named EB Garamond, DEF-FONT-002), line pitch as typst; reference-src, reference.docx and reference-addendum.docx dropped (the addendum takes rIdFtrAdd through FORMBOOK_FINAL); TOC and TOA page numbers from the multi-pass engine, retiring render.sh and pages.lua; TOC as one table with the page column inside the margin; hanging indents restored (firstLine=0 cancelled hanging in LibreOffice); last paragraph kept with the signature; certificates name the face used; answering word count leaves out the oral-argument statement as typst (1,146); opening certificate of service keeps the full date and the cover prints counsel_for; check.sh --engine docx 8/0 and 9/0 (fb-595.63)
</commit_message>
<xml_diff>
--- a/courts/sixth-circuit/court-of-appeals/answering-brief/usage/OUTPUT-answering-brief.docx
+++ b/courts/sixth-circuit/court-of-appeals/answering-brief/usage/OUTPUT-answering-brief.docx
@@ -238,7 +238,7 @@
       <w:pPr>
         <w:pStyle w:val="CASectionBreak"/>
         <w:sectPr>
-          <w:footerReference w:type="default" r:id="rIdFtr0"/>
+          <w:footerReference w:type="default" r:id="rIdFtrNone"/>
           <w:pgSz w:w="12240" w:h="15840"/>
           <w:pgMar w:top="1440" w:right="1440" w:bottom="1440" w:left="1440" w:header="720" w:footer="720" w:gutter="0"/>
         </w:sectPr>
@@ -308,7 +308,7 @@
       <w:pPr>
         <w:pStyle w:val="CASectionBreak"/>
         <w:sectPr>
-          <w:footerReference w:type="default" r:id="rIdFtr0"/>
+          <w:footerReference w:type="default" r:id="rIdFtrNone"/>
           <w:pgSz w:w="12240" w:h="15840"/>
           <w:pgMar w:top="1440" w:right="1440" w:bottom="1440" w:left="1440" w:header="720" w:footer="720" w:gutter="0"/>
         </w:sectPr>
@@ -335,223 +335,6 @@
         <w:t xml:space="preserve">Page</w:t>
       </w:r>
     </w:p>
-    <w:tbl>
-      <w:tblPr>
-        <w:tblStyle w:val="Table"/>
-        <w:tblW w:type="pct" w:w="5000"/>
-        <w:tblLayout w:type="fixed"/>
-        <w:tblLook w:firstRow="0" w:lastRow="0" w:firstColumn="0" w:lastColumn="0" w:noHBand="0" w:noVBand="0" w:val="0000"/>
-      </w:tblPr>
-      <w:tblGrid>
-        <w:gridCol w:w="7920"/>
-      </w:tblGrid>
-      <w:tr>
-        <w:tc>
-          <w:tcPr/>
-          <w:p>
-            <w:pPr>
-              <w:pStyle w:val="CATOCTextTop"/>
-            </w:pPr>
-            <w:r>
-              <w:t xml:space="preserve">TABLE OF AUTHORITIES</w:t>
-            </w:r>
-            <w:r>
-              <w:tab/>
-            </w:r>
-            <w:r>
-              <w:t xml:space="preserve">iii</w:t>
-            </w:r>
-          </w:p>
-        </w:tc>
-      </w:tr>
-    </w:tbl>
-    <w:p/>
-    <w:tbl>
-      <w:tblPr>
-        <w:tblStyle w:val="Table"/>
-        <w:tblW w:type="pct" w:w="5000"/>
-        <w:tblLayout w:type="fixed"/>
-        <w:tblLook w:firstRow="0" w:lastRow="0" w:firstColumn="0" w:lastColumn="0" w:noHBand="0" w:noVBand="0" w:val="0000"/>
-      </w:tblPr>
-      <w:tblGrid>
-        <w:gridCol w:w="7920"/>
-      </w:tblGrid>
-      <w:tr>
-        <w:tc>
-          <w:tcPr/>
-          <w:p>
-            <w:pPr>
-              <w:pStyle w:val="CATOCTextTop"/>
-            </w:pPr>
-            <w:r>
-              <w:t xml:space="preserve">STATEMENT IN SUPPORT OF ORAL ARGUMENT</w:t>
-            </w:r>
-            <w:r>
-              <w:tab/>
-            </w:r>
-            <w:r>
-              <w:t xml:space="preserve">v</w:t>
-            </w:r>
-          </w:p>
-        </w:tc>
-      </w:tr>
-    </w:tbl>
-    <w:p/>
-    <w:tbl>
-      <w:tblPr>
-        <w:tblStyle w:val="Table"/>
-        <w:tblW w:type="pct" w:w="5000"/>
-        <w:tblLayout w:type="fixed"/>
-        <w:tblLook w:firstRow="0" w:lastRow="0" w:firstColumn="0" w:lastColumn="0" w:noHBand="0" w:noVBand="0" w:val="0000"/>
-      </w:tblPr>
-      <w:tblGrid>
-        <w:gridCol w:w="7920"/>
-      </w:tblGrid>
-      <w:tr>
-        <w:tc>
-          <w:tcPr/>
-          <w:p>
-            <w:pPr>
-              <w:pStyle w:val="CATOCTextTop"/>
-            </w:pPr>
-            <w:r>
-              <w:t xml:space="preserve">STATEMENT REGARDING JURISDICTION</w:t>
-            </w:r>
-            <w:r>
-              <w:tab/>
-            </w:r>
-            <w:r>
-              <w:t xml:space="preserve">v</w:t>
-            </w:r>
-          </w:p>
-        </w:tc>
-      </w:tr>
-    </w:tbl>
-    <w:p/>
-    <w:tbl>
-      <w:tblPr>
-        <w:tblStyle w:val="Table"/>
-        <w:tblW w:type="pct" w:w="5000"/>
-        <w:tblLayout w:type="fixed"/>
-        <w:tblLook w:firstRow="0" w:lastRow="0" w:firstColumn="0" w:lastColumn="0" w:noHBand="0" w:noVBand="0" w:val="0000"/>
-      </w:tblPr>
-      <w:tblGrid>
-        <w:gridCol w:w="7920"/>
-      </w:tblGrid>
-      <w:tr>
-        <w:tc>
-          <w:tcPr/>
-          <w:p>
-            <w:pPr>
-              <w:pStyle w:val="CATOCTextTop"/>
-            </w:pPr>
-            <w:r>
-              <w:t xml:space="preserve">COUNTER-STATEMENT OF ISSUES PRESENTED FOR REVIEW</w:t>
-            </w:r>
-            <w:r>
-              <w:tab/>
-            </w:r>
-            <w:r>
-              <w:t xml:space="preserve">v</w:t>
-            </w:r>
-          </w:p>
-        </w:tc>
-      </w:tr>
-    </w:tbl>
-    <w:p/>
-    <w:tbl>
-      <w:tblPr>
-        <w:tblStyle w:val="Table"/>
-        <w:tblW w:type="pct" w:w="5000"/>
-        <w:tblLayout w:type="fixed"/>
-        <w:tblLook w:firstRow="0" w:lastRow="0" w:firstColumn="0" w:lastColumn="0" w:noHBand="0" w:noVBand="0" w:val="0000"/>
-      </w:tblPr>
-      <w:tblGrid>
-        <w:gridCol w:w="7920"/>
-      </w:tblGrid>
-      <w:tr>
-        <w:tc>
-          <w:tcPr/>
-          <w:p>
-            <w:pPr>
-              <w:pStyle w:val="CATOCTextTop"/>
-            </w:pPr>
-            <w:r>
-              <w:t xml:space="preserve">COUNTER-STATEMENT OF THE CASE</w:t>
-            </w:r>
-            <w:r>
-              <w:tab/>
-            </w:r>
-            <w:r>
-              <w:t xml:space="preserve">1</w:t>
-            </w:r>
-          </w:p>
-        </w:tc>
-      </w:tr>
-    </w:tbl>
-    <w:p/>
-    <w:tbl>
-      <w:tblPr>
-        <w:tblStyle w:val="Table"/>
-        <w:tblW w:type="pct" w:w="5000"/>
-        <w:tblLayout w:type="fixed"/>
-        <w:tblLook w:firstRow="0" w:lastRow="0" w:firstColumn="0" w:lastColumn="0" w:noHBand="0" w:noVBand="0" w:val="0000"/>
-      </w:tblPr>
-      <w:tblGrid>
-        <w:gridCol w:w="7920"/>
-      </w:tblGrid>
-      <w:tr>
-        <w:tc>
-          <w:tcPr/>
-          <w:p>
-            <w:pPr>
-              <w:pStyle w:val="CATOCTextTop"/>
-            </w:pPr>
-            <w:r>
-              <w:t xml:space="preserve">SUMMARY OF ARGUMENT</w:t>
-            </w:r>
-            <w:r>
-              <w:tab/>
-            </w:r>
-            <w:r>
-              <w:t xml:space="preserve">2</w:t>
-            </w:r>
-          </w:p>
-        </w:tc>
-      </w:tr>
-    </w:tbl>
-    <w:p/>
-    <w:tbl>
-      <w:tblPr>
-        <w:tblStyle w:val="Table"/>
-        <w:tblW w:type="pct" w:w="5000"/>
-        <w:tblLayout w:type="fixed"/>
-        <w:tblLook w:firstRow="0" w:lastRow="0" w:firstColumn="0" w:lastColumn="0" w:noHBand="0" w:noVBand="0" w:val="0000"/>
-      </w:tblPr>
-      <w:tblGrid>
-        <w:gridCol w:w="7920"/>
-      </w:tblGrid>
-      <w:tr>
-        <w:tc>
-          <w:tcPr/>
-          <w:p>
-            <w:pPr>
-              <w:pStyle w:val="CATOCTextTop"/>
-            </w:pPr>
-            <w:r>
-              <w:t xml:space="preserve">ARGUMENT</w:t>
-            </w:r>
-            <w:r>
-              <w:tab/>
-            </w:r>
-            <w:r>
-              <w:t xml:space="preserve">2</w:t>
-            </w:r>
-          </w:p>
-        </w:tc>
-      </w:tr>
-    </w:tbl>
-    <w:p/>
     <w:tbl>
       <w:tblPr>
         <w:tblStyle w:val="Table"/>
@@ -561,8 +344,158 @@
       </w:tblPr>
       <w:tblGrid>
         <w:gridCol w:w="609"/>
-        <w:gridCol w:w="7310"/>
+        <w:gridCol w:w="609"/>
+        <w:gridCol w:w="609"/>
+        <w:gridCol w:w="609"/>
+        <w:gridCol w:w="5483"/>
       </w:tblGrid>
+      <w:tr>
+        <w:tc>
+          <w:tcPr>
+            <w:gridSpan w:val="5"/>
+          </w:tcPr>
+          <w:p>
+            <w:pPr>
+              <w:pStyle w:val="CATOCTextTop"/>
+            </w:pPr>
+            <w:r>
+              <w:t xml:space="preserve">TABLE OF AUTHORITIES</w:t>
+            </w:r>
+            <w:r>
+              <w:tab/>
+            </w:r>
+            <w:r>
+              <w:t xml:space="preserve">ii</w:t>
+            </w:r>
+          </w:p>
+        </w:tc>
+      </w:tr>
+      <w:tr>
+        <w:tc>
+          <w:tcPr>
+            <w:gridSpan w:val="5"/>
+          </w:tcPr>
+          <w:p>
+            <w:pPr>
+              <w:pStyle w:val="CATOCTextTop"/>
+            </w:pPr>
+            <w:r>
+              <w:t xml:space="preserve">STATEMENT IN SUPPORT OF ORAL ARGUMENT</w:t>
+            </w:r>
+            <w:r>
+              <w:tab/>
+            </w:r>
+            <w:r>
+              <w:t xml:space="preserve">iv</w:t>
+            </w:r>
+          </w:p>
+        </w:tc>
+      </w:tr>
+      <w:tr>
+        <w:tc>
+          <w:tcPr>
+            <w:gridSpan w:val="5"/>
+          </w:tcPr>
+          <w:p>
+            <w:pPr>
+              <w:pStyle w:val="CATOCTextTop"/>
+            </w:pPr>
+            <w:r>
+              <w:t xml:space="preserve">STATEMENT REGARDING JURISDICTION</w:t>
+            </w:r>
+            <w:r>
+              <w:tab/>
+            </w:r>
+            <w:r>
+              <w:t xml:space="preserve">iv</w:t>
+            </w:r>
+          </w:p>
+        </w:tc>
+      </w:tr>
+      <w:tr>
+        <w:tc>
+          <w:tcPr>
+            <w:gridSpan w:val="5"/>
+          </w:tcPr>
+          <w:p>
+            <w:pPr>
+              <w:pStyle w:val="CATOCTextTop"/>
+            </w:pPr>
+            <w:r>
+              <w:t xml:space="preserve">COUNTER-STATEMENT OF ISSUES PRESENTED FOR REVIEW</w:t>
+            </w:r>
+            <w:r>
+              <w:tab/>
+            </w:r>
+            <w:r>
+              <w:t xml:space="preserve">iv</w:t>
+            </w:r>
+          </w:p>
+        </w:tc>
+      </w:tr>
+      <w:tr>
+        <w:tc>
+          <w:tcPr>
+            <w:gridSpan w:val="5"/>
+          </w:tcPr>
+          <w:p>
+            <w:pPr>
+              <w:pStyle w:val="CATOCTextTop"/>
+            </w:pPr>
+            <w:r>
+              <w:t xml:space="preserve">COUNTER-STATEMENT OF THE CASE</w:t>
+            </w:r>
+            <w:r>
+              <w:tab/>
+            </w:r>
+            <w:r>
+              <w:t xml:space="preserve">1</w:t>
+            </w:r>
+          </w:p>
+        </w:tc>
+      </w:tr>
+      <w:tr>
+        <w:tc>
+          <w:tcPr>
+            <w:gridSpan w:val="5"/>
+          </w:tcPr>
+          <w:p>
+            <w:pPr>
+              <w:pStyle w:val="CATOCTextTop"/>
+            </w:pPr>
+            <w:r>
+              <w:t xml:space="preserve">SUMMARY OF ARGUMENT</w:t>
+            </w:r>
+            <w:r>
+              <w:tab/>
+            </w:r>
+            <w:r>
+              <w:t xml:space="preserve">2</w:t>
+            </w:r>
+          </w:p>
+        </w:tc>
+      </w:tr>
+      <w:tr>
+        <w:tc>
+          <w:tcPr>
+            <w:gridSpan w:val="5"/>
+          </w:tcPr>
+          <w:p>
+            <w:pPr>
+              <w:pStyle w:val="CATOCTextTop"/>
+            </w:pPr>
+            <w:r>
+              <w:t xml:space="preserve">ARGUMENT</w:t>
+            </w:r>
+            <w:r>
+              <w:tab/>
+            </w:r>
+            <w:r>
+              <w:t xml:space="preserve">3</w:t>
+            </w:r>
+          </w:p>
+        </w:tc>
+      </w:tr>
       <w:tr>
         <w:tc>
           <w:tcPr/>
@@ -576,7 +509,9 @@
           </w:p>
         </w:tc>
         <w:tc>
-          <w:tcPr/>
+          <w:tcPr>
+            <w:gridSpan w:val="4"/>
+          </w:tcPr>
           <w:p>
             <w:pPr>
               <w:pStyle w:val="CATOCText0"/>
@@ -588,24 +523,11 @@
               <w:tab/>
             </w:r>
             <w:r>
-              <w:t xml:space="preserve">2</w:t>
+              <w:t xml:space="preserve">3</w:t>
             </w:r>
           </w:p>
         </w:tc>
       </w:tr>
-    </w:tbl>
-    <w:p/>
-    <w:tbl>
-      <w:tblPr>
-        <w:tblStyle w:val="Table"/>
-        <w:tblW w:type="pct" w:w="5000"/>
-        <w:tblLayout w:type="fixed"/>
-        <w:tblLook w:firstRow="0" w:lastRow="0" w:firstColumn="0" w:lastColumn="0" w:noHBand="0" w:noVBand="0" w:val="0000"/>
-      </w:tblPr>
-      <w:tblGrid>
-        <w:gridCol w:w="609"/>
-        <w:gridCol w:w="7310"/>
-      </w:tblGrid>
       <w:tr>
         <w:tc>
           <w:tcPr/>
@@ -619,7 +541,9 @@
           </w:p>
         </w:tc>
         <w:tc>
-          <w:tcPr/>
+          <w:tcPr>
+            <w:gridSpan w:val="4"/>
+          </w:tcPr>
           <w:p>
             <w:pPr>
               <w:pStyle w:val="CATOCText0"/>
@@ -636,22 +560,11 @@
           </w:p>
         </w:tc>
       </w:tr>
-    </w:tbl>
-    <w:p/>
-    <w:tbl>
-      <w:tblPr>
-        <w:tblStyle w:val="Table"/>
-        <w:tblW w:type="pct" w:w="5000"/>
-        <w:tblLayout w:type="fixed"/>
-        <w:tblLook w:firstRow="0" w:lastRow="0" w:firstColumn="0" w:lastColumn="0" w:noHBand="0" w:noVBand="0" w:val="0000"/>
-      </w:tblPr>
-      <w:tblGrid>
-        <w:gridCol w:w="1218"/>
-        <w:gridCol w:w="6701"/>
-      </w:tblGrid>
       <w:tr>
         <w:tc>
-          <w:tcPr/>
+          <w:tcPr>
+            <w:gridSpan w:val="2"/>
+          </w:tcPr>
           <w:p>
             <w:pPr>
               <w:pStyle w:val="CATOCLabel1"/>
@@ -662,7 +575,9 @@
           </w:p>
         </w:tc>
         <w:tc>
-          <w:tcPr/>
+          <w:tcPr>
+            <w:gridSpan w:val="3"/>
+          </w:tcPr>
           <w:p>
             <w:pPr>
               <w:pStyle w:val="CATOCText1"/>
@@ -695,22 +610,11 @@
           </w:p>
         </w:tc>
       </w:tr>
-    </w:tbl>
-    <w:p/>
-    <w:tbl>
-      <w:tblPr>
-        <w:tblStyle w:val="Table"/>
-        <w:tblW w:type="pct" w:w="5000"/>
-        <w:tblLayout w:type="fixed"/>
-        <w:tblLook w:firstRow="0" w:lastRow="0" w:firstColumn="0" w:lastColumn="0" w:noHBand="0" w:noVBand="0" w:val="0000"/>
-      </w:tblPr>
-      <w:tblGrid>
-        <w:gridCol w:w="1218"/>
-        <w:gridCol w:w="6701"/>
-      </w:tblGrid>
       <w:tr>
         <w:tc>
-          <w:tcPr/>
+          <w:tcPr>
+            <w:gridSpan w:val="2"/>
+          </w:tcPr>
           <w:p>
             <w:pPr>
               <w:pStyle w:val="CATOCLabel1"/>
@@ -721,7 +625,9 @@
           </w:p>
         </w:tc>
         <w:tc>
-          <w:tcPr/>
+          <w:tcPr>
+            <w:gridSpan w:val="3"/>
+          </w:tcPr>
           <w:p>
             <w:pPr>
               <w:pStyle w:val="CATOCText1"/>
@@ -738,19 +644,6 @@
           </w:p>
         </w:tc>
       </w:tr>
-    </w:tbl>
-    <w:p/>
-    <w:tbl>
-      <w:tblPr>
-        <w:tblStyle w:val="Table"/>
-        <w:tblW w:type="pct" w:w="5000"/>
-        <w:tblLayout w:type="fixed"/>
-        <w:tblLook w:firstRow="0" w:lastRow="0" w:firstColumn="0" w:lastColumn="0" w:noHBand="0" w:noVBand="0" w:val="0000"/>
-      </w:tblPr>
-      <w:tblGrid>
-        <w:gridCol w:w="609"/>
-        <w:gridCol w:w="7310"/>
-      </w:tblGrid>
       <w:tr>
         <w:tc>
           <w:tcPr/>
@@ -764,7 +657,9 @@
           </w:p>
         </w:tc>
         <w:tc>
-          <w:tcPr/>
+          <w:tcPr>
+            <w:gridSpan w:val="4"/>
+          </w:tcPr>
           <w:p>
             <w:pPr>
               <w:pStyle w:val="CATOCText0"/>
@@ -776,105 +671,75 @@
               <w:tab/>
             </w:r>
             <w:r>
-              <w:t xml:space="preserve">4</w:t>
+              <w:t xml:space="preserve">5</w:t>
+            </w:r>
+          </w:p>
+        </w:tc>
+      </w:tr>
+      <w:tr>
+        <w:tc>
+          <w:tcPr>
+            <w:gridSpan w:val="5"/>
+          </w:tcPr>
+          <w:p>
+            <w:pPr>
+              <w:pStyle w:val="CATOCTextTop"/>
+            </w:pPr>
+            <w:r>
+              <w:t xml:space="preserve">CONCLUSION AND RELIEF REQUESTED</w:t>
+            </w:r>
+            <w:r>
+              <w:tab/>
+            </w:r>
+            <w:r>
+              <w:t xml:space="preserve">7</w:t>
+            </w:r>
+          </w:p>
+        </w:tc>
+      </w:tr>
+      <w:tr>
+        <w:tc>
+          <w:tcPr>
+            <w:gridSpan w:val="5"/>
+          </w:tcPr>
+          <w:p>
+            <w:pPr>
+              <w:pStyle w:val="CATOCTextTop"/>
+            </w:pPr>
+            <w:r>
+              <w:t xml:space="preserve">CERTIFICATE OF COMPLIANCE</w:t>
+            </w:r>
+            <w:r>
+              <w:tab/>
+            </w:r>
+            <w:r>
+              <w:t xml:space="preserve">8</w:t>
+            </w:r>
+          </w:p>
+        </w:tc>
+      </w:tr>
+      <w:tr>
+        <w:tc>
+          <w:tcPr>
+            <w:gridSpan w:val="5"/>
+          </w:tcPr>
+          <w:p>
+            <w:pPr>
+              <w:pStyle w:val="CATOCTextTop"/>
+            </w:pPr>
+            <w:r>
+              <w:t xml:space="preserve">CERTIFICATE OF SERVICE</w:t>
+            </w:r>
+            <w:r>
+              <w:tab/>
+            </w:r>
+            <w:r>
+              <w:t xml:space="preserve">9</w:t>
             </w:r>
           </w:p>
         </w:tc>
       </w:tr>
     </w:tbl>
-    <w:p/>
-    <w:tbl>
-      <w:tblPr>
-        <w:tblStyle w:val="Table"/>
-        <w:tblW w:type="pct" w:w="5000"/>
-        <w:tblLayout w:type="fixed"/>
-        <w:tblLook w:firstRow="0" w:lastRow="0" w:firstColumn="0" w:lastColumn="0" w:noHBand="0" w:noVBand="0" w:val="0000"/>
-      </w:tblPr>
-      <w:tblGrid>
-        <w:gridCol w:w="7920"/>
-      </w:tblGrid>
-      <w:tr>
-        <w:tc>
-          <w:tcPr/>
-          <w:p>
-            <w:pPr>
-              <w:pStyle w:val="CATOCTextTop"/>
-            </w:pPr>
-            <w:r>
-              <w:t xml:space="preserve">CONCLUSION AND RELIEF REQUESTED</w:t>
-            </w:r>
-            <w:r>
-              <w:tab/>
-            </w:r>
-            <w:r>
-              <w:t xml:space="preserve">5</w:t>
-            </w:r>
-          </w:p>
-        </w:tc>
-      </w:tr>
-    </w:tbl>
-    <w:p/>
-    <w:tbl>
-      <w:tblPr>
-        <w:tblStyle w:val="Table"/>
-        <w:tblW w:type="pct" w:w="5000"/>
-        <w:tblLayout w:type="fixed"/>
-        <w:tblLook w:firstRow="0" w:lastRow="0" w:firstColumn="0" w:lastColumn="0" w:noHBand="0" w:noVBand="0" w:val="0000"/>
-      </w:tblPr>
-      <w:tblGrid>
-        <w:gridCol w:w="7920"/>
-      </w:tblGrid>
-      <w:tr>
-        <w:tc>
-          <w:tcPr/>
-          <w:p>
-            <w:pPr>
-              <w:pStyle w:val="CATOCTextTop"/>
-            </w:pPr>
-            <w:r>
-              <w:t xml:space="preserve">CERTIFICATE OF COMPLIANCE</w:t>
-            </w:r>
-            <w:r>
-              <w:tab/>
-            </w:r>
-            <w:r>
-              <w:t xml:space="preserve">7</w:t>
-            </w:r>
-          </w:p>
-        </w:tc>
-      </w:tr>
-    </w:tbl>
-    <w:p/>
-    <w:tbl>
-      <w:tblPr>
-        <w:tblStyle w:val="Table"/>
-        <w:tblW w:type="pct" w:w="5000"/>
-        <w:tblLayout w:type="fixed"/>
-        <w:tblLook w:firstRow="0" w:lastRow="0" w:firstColumn="0" w:lastColumn="0" w:noHBand="0" w:noVBand="0" w:val="0000"/>
-      </w:tblPr>
-      <w:tblGrid>
-        <w:gridCol w:w="7920"/>
-      </w:tblGrid>
-      <w:tr>
-        <w:tc>
-          <w:tcPr/>
-          <w:p>
-            <w:pPr>
-              <w:pStyle w:val="CATOCTextTop"/>
-            </w:pPr>
-            <w:r>
-              <w:t xml:space="preserve">CERTIFICATE OF SERVICE</w:t>
-            </w:r>
-            <w:r>
-              <w:tab/>
-            </w:r>
-            <w:r>
-              <w:t xml:space="preserve">8</w:t>
-            </w:r>
-          </w:p>
-        </w:tc>
-      </w:tr>
-    </w:tbl>
     <w:p>
       <w:pPr>
         <w:pStyle w:val="CASectionNewPage"/>
@@ -953,7 +818,7 @@
         <w:tab/>
       </w:r>
       <w:r>
-        <w:t xml:space="preserve">5</w:t>
+        <w:t xml:space="preserve">6</w:t>
       </w:r>
     </w:p>
     <w:p>
@@ -980,7 +845,7 @@
         <w:tab/>
       </w:r>
       <w:r>
-        <w:t xml:space="preserve">5</w:t>
+        <w:t xml:space="preserve">6</w:t>
       </w:r>
     </w:p>
     <w:p>
@@ -1007,7 +872,7 @@
         <w:tab/>
       </w:r>
       <w:r>
-        <w:t xml:space="preserve">2, 3, 4</w:t>
+        <w:t xml:space="preserve">2, 4, 5</w:t>
       </w:r>
     </w:p>
     <w:p>
@@ -1061,7 +926,7 @@
         <w:tab/>
       </w:r>
       <w:r>
-        <w:t xml:space="preserve">5</w:t>
+        <w:t xml:space="preserve">6</w:t>
       </w:r>
     </w:p>
     <w:p>
@@ -1115,7 +980,7 @@
         <w:tab/>
       </w:r>
       <w:r>
-        <w:t xml:space="preserve">4</w:t>
+        <w:t xml:space="preserve">5</w:t>
       </w:r>
     </w:p>
     <w:p>
@@ -1169,7 +1034,7 @@
         <w:tab/>
       </w:r>
       <w:r>
-        <w:t xml:space="preserve">2, 3</w:t>
+        <w:t xml:space="preserve">3</w:t>
       </w:r>
     </w:p>
     <w:p>
@@ -1196,7 +1061,7 @@
         <w:tab/>
       </w:r>
       <w:r>
-        <w:t xml:space="preserve">5</w:t>
+        <w:t xml:space="preserve">6</w:t>
       </w:r>
     </w:p>
     <w:p>
@@ -1250,7 +1115,7 @@
         <w:tab/>
       </w:r>
       <w:r>
-        <w:t xml:space="preserve">5</w:t>
+        <w:t xml:space="preserve">6</w:t>
       </w:r>
     </w:p>
     <w:p>
@@ -1365,7 +1230,7 @@
       <w:pPr>
         <w:pStyle w:val="CASectionBreak"/>
         <w:sectPr>
-          <w:footerReference w:type="default" r:id="rIdFtr1"/>
+          <w:footerReference w:type="default" r:id="rIdFtrPage"/>
           <w:pgSz w:w="12240" w:h="15840"/>
           <w:pgMar w:top="1440" w:right="1440" w:bottom="1440" w:left="1440" w:header="720" w:footer="720" w:gutter="0"/>
           <w:pgNumType w:fmt="lowerRoman" w:start="1"/>
@@ -1408,7 +1273,13 @@
         <w:t xml:space="preserve">Krieger v. Department of Environment, Great Lakes, and Energy</w:t>
       </w:r>
       <w:r>
-        <w:t xml:space="preserve">, No. 359859, 2023 WL 5808605 (Mich. Ct. App. Sept. 7, 2023) (Plaintiffs-Appellants’ Brief, pp. 8, 11-15, 17-18).</w:t>
+        <w:t xml:space="preserve">, No. 359859, 2023 WL 5808605 (Mich. Ct. App. Sept. 7, 2023)</w:t>
+      </w:r>
+      <w:r>
+        <w:t xml:space="preserve"> </w:t>
+      </w:r>
+      <w:r>
+        <w:t xml:space="preserve">(Plaintiffs-Appellants’ Brief, pp. 8, 11-15, 17-18).</w:t>
       </w:r>
     </w:p>
     <w:p>
@@ -1445,7 +1316,10 @@
         <w:t xml:space="preserve">Krieger</w:t>
       </w:r>
       <w:r>
-        <w:t xml:space="preserve">, at *2, 13. The analysis is not dispositive against Midland and Gladwin Counties. This case must be decided on the actual evidentiary record as it relates to the Counties.</w:t>
+        <w:t xml:space="preserve">, at *2, 13</w:t>
+      </w:r>
+      <w:r>
+        <w:t xml:space="preserve">. The analysis is not dispositive against Midland and Gladwin Counties. This case must be decided on the actual evidentiary record as it relates to the Counties.</w:t>
       </w:r>
     </w:p>
     <w:p>
@@ -1463,7 +1337,19 @@
         <w:t xml:space="preserve"> </w:t>
       </w:r>
       <w:r>
-        <w:t xml:space="preserve">When Boyce failed to satisfy repeated demands by the Federal Energy Regulatory Commission (FERC) for the spillway capacity to be upgraded, the FERC revoked the Edenville Dam’s power generation license effective September 10, 2018. (R. 59-7, Pg ID 3634-3663, FERC Order Revoking Boyce Hydro License; R. 59-8, Pg ID 3774-3775, IFT Final Report, pp. 86-87). Regulatory authority over the dam then fell to the Michigan Department of Environment, Great Lakes and Energy (EGLE). Mich. Comp. Laws §§ 324.31506 et seq. (R. 59-8, Pg ID 3695, IFT Final Report, p. 7).</w:t>
+        <w:t xml:space="preserve">When Boyce failed to satisfy repeated demands by the Federal Energy Regulatory Commission (FERC) for the spillway capacity to be upgraded, the FERC revoked the Edenville Dam’s power generation license effective September 10, 2018. (R. 59-7, Pg ID 3634-3663, FERC Order Revoking Boyce Hydro License; R. 59-8, Pg ID 3774-3775, IFT Final Report, pp. 86-87). Regulatory authority over the dam then fell to the Michigan Department of Environment, Great Lakes and Energy (EGLE).</w:t>
+      </w:r>
+      <w:r>
+        <w:t xml:space="preserve"> </w:t>
+      </w:r>
+      <w:r>
+        <w:t xml:space="preserve">Mich. Comp. Laws §§ 324.31506 et seq.</w:t>
+      </w:r>
+      <w:r>
+        <w:t xml:space="preserve"> </w:t>
+      </w:r>
+      <w:r>
+        <w:t xml:space="preserve">(R. 59-8, Pg ID 3695, IFT Final Report, p. 7).</w:t>
       </w:r>
     </w:p>
     <w:p>
@@ -1492,7 +1378,10 @@
         <w:t xml:space="preserve">Blue Harvest, Inc. v. Department of Transportation</w:t>
       </w:r>
       <w:r>
-        <w:t xml:space="preserve">, 288 Mich. App. 267, 277, 792 N.W.2d 798, 805 (2010). The only action by the counties was a petition to maintain the lake level that the FERC had deemed proper for two decades. That petition was not an “abuse,” and it was aimed at the lake, not at the Plaintiffs-Appellants’ downstream properties.</w:t>
+        <w:t xml:space="preserve">, 288 Mich. App. 267, 277, 792 N.W.2d 798, 805 (2010)</w:t>
+      </w:r>
+      <w:r>
+        <w:t xml:space="preserve">. The only action by the counties was a petition to maintain the lake level that the FERC had deemed proper for two decades. That petition was not an “abuse,” and it was aimed at the lake, not at the Plaintiffs-Appellants’ downstream properties.</w:t>
       </w:r>
     </w:p>
     <w:p>
@@ -1529,7 +1418,19 @@
         <w:t xml:space="preserve">Puskas v. Delaware County, Ohio</w:t>
       </w:r>
       <w:r>
-        <w:t xml:space="preserve">, 56 F.4th 1088, 1093 (6th Cir. 2023). Summary judgment is properly granted where “there is no genuine issue as to any material fact and the movant is entitled to judgment as a matter of law.” Fed. R. Civ. P. 56(a);</w:t>
+        <w:t xml:space="preserve">, 56 F.4th 1088, 1093 (6th Cir. 2023)</w:t>
+      </w:r>
+      <w:r>
+        <w:t xml:space="preserve">. Summary judgment is properly granted where “there is no genuine issue as to any material fact and the movant is entitled to judgment as a matter of law.”</w:t>
+      </w:r>
+      <w:r>
+        <w:t xml:space="preserve"> </w:t>
+      </w:r>
+      <w:r>
+        <w:t xml:space="preserve">Fed. R. Civ. P. 56(a)</w:t>
+      </w:r>
+      <w:r>
+        <w:t xml:space="preserve">;</w:t>
       </w:r>
       <w:r>
         <w:t xml:space="preserve"> </w:t>
@@ -1542,7 +1443,10 @@
         <w:t xml:space="preserve">Puskas</w:t>
       </w:r>
       <w:r>
-        <w:t xml:space="preserve">, 56 F.4th at 1093. “[T]he mere existence of some alleged factual dispute between the parties will not defeat an otherwise properly supported motion for summary judgment; the requirement is that there be no genuine issue of material fact.”</w:t>
+        <w:t xml:space="preserve">, 56 F.4th at 1093</w:t>
+      </w:r>
+      <w:r>
+        <w:t xml:space="preserve">. “[T]he mere existence of some alleged factual dispute between the parties will not defeat an otherwise properly supported motion for summary judgment; the requirement is that there be no genuine issue of material fact.”</w:t>
       </w:r>
       <w:r>
         <w:t xml:space="preserve"> </w:t>
@@ -1555,7 +1459,13 @@
         <w:t xml:space="preserve">Anderson v. Liberty Lobby, Inc.</w:t>
       </w:r>
       <w:r>
-        <w:t xml:space="preserve">, 477 U.S. 242, 247-48 (1986) (emphasis in original).</w:t>
+        <w:t xml:space="preserve">, 477 U.S. 242, 247-48 (1986)</w:t>
+      </w:r>
+      <w:r>
+        <w:t xml:space="preserve"> </w:t>
+      </w:r>
+      <w:r>
+        <w:t xml:space="preserve">(emphasis in original).</w:t>
       </w:r>
     </w:p>
     <w:p>
@@ -1614,7 +1524,13 @@
         <w:t xml:space="preserve">Blue Harvest</w:t>
       </w:r>
       <w:r>
-        <w:t xml:space="preserve">, 288 Mich. App. at 277 (Plaintiffs-Appellants’ Brief, p. 11).</w:t>
+        <w:t xml:space="preserve">, 288 Mich. App. at 277</w:t>
+      </w:r>
+      <w:r>
+        <w:t xml:space="preserve"> </w:t>
+      </w:r>
+      <w:r>
+        <w:t xml:space="preserve">(Plaintiffs-Appellants’ Brief, p. 11).</w:t>
       </w:r>
     </w:p>
     <w:p>
@@ -1651,7 +1567,10 @@
         <w:t xml:space="preserve">Cox v. Kentucky Department of Transportation</w:t>
       </w:r>
       <w:r>
-        <w:t xml:space="preserve">, 53 F.3d 146, 149 (6th Cir. 1995).</w:t>
+        <w:t xml:space="preserve">, 53 F.3d 146, 149 (6th Cir. 1995)</w:t>
+      </w:r>
+      <w:r>
+        <w:t xml:space="preserve">.</w:t>
       </w:r>
     </w:p>
     <w:p>
@@ -1694,7 +1613,10 @@
         <w:t xml:space="preserve">Blue Harvest, Inc.</w:t>
       </w:r>
       <w:r>
-        <w:t xml:space="preserve">, 288 Mich. App. at 277.</w:t>
+        <w:t xml:space="preserve">, 288 Mich. App. at 277</w:t>
+      </w:r>
+      <w:r>
+        <w:t xml:space="preserve">.</w:t>
       </w:r>
     </w:p>
     <w:p>
@@ -1723,7 +1645,10 @@
         <w:t xml:space="preserve">McCarthy v. City of Cleveland</w:t>
       </w:r>
       <w:r>
-        <w:t xml:space="preserve">, 626 F.3d 280, 284 (6th Cir. 2010). The Plaintiffs-Appellants’ claim is predicated upon a physical intrusion, i.e., flooding of their properties. It is “inappropriate to treat cases involving physical takings as controlling precedents for the evaluations of a claim that there has been a regulatory taking, and vice versa.”</w:t>
+        <w:t xml:space="preserve">, 626 F.3d 280, 284 (6th Cir. 2010)</w:t>
+      </w:r>
+      <w:r>
+        <w:t xml:space="preserve">. The Plaintiffs-Appellants’ claim is predicated upon a physical intrusion, i.e., flooding of their properties. It is “inappropriate to treat cases involving physical takings as controlling precedents for the evaluations of a claim that there has been a regulatory taking, and vice versa.”</w:t>
       </w:r>
       <w:r>
         <w:t xml:space="preserve"> </w:t>
@@ -1736,7 +1661,10 @@
         <w:t xml:space="preserve">Tahoe-Sierra Preservation Council, Inc. v. Tahoe Regional Planning Agency</w:t>
       </w:r>
       <w:r>
-        <w:t xml:space="preserve">, 535 U.S. 302, 323 (2002).</w:t>
+        <w:t xml:space="preserve">, 535 U.S. 302, 323 (2002)</w:t>
+      </w:r>
+      <w:r>
+        <w:t xml:space="preserve">.</w:t>
       </w:r>
     </w:p>
     <w:p>
@@ -1757,7 +1685,13 @@
         <w:t xml:space="preserve">Pumpelly v. Green Bay Co.</w:t>
       </w:r>
       <w:r>
-        <w:t xml:space="preserve">, 80 U.S. 166, 181 (1871) for the proposition that a flood can be a taking. But the case law that has developed in the 150 years since</w:t>
+        <w:t xml:space="preserve">, 80 U.S. 166, 181 (1871)</w:t>
+      </w:r>
+      <w:r>
+        <w:t xml:space="preserve"> </w:t>
+      </w:r>
+      <w:r>
+        <w:t xml:space="preserve">for the proposition that a flood can be a taking. But the case law that has developed in the 150 years since</w:t>
       </w:r>
       <w:r>
         <w:t xml:space="preserve"> </w:t>
@@ -1794,7 +1728,10 @@
         <w:t xml:space="preserve">Arkansas Game and Fish Commission v. United States</w:t>
       </w:r>
       <w:r>
-        <w:t xml:space="preserve">, 568 U.S. 23, 36 (2012), both the duration and frequency of flooding remain critical factors. As long-established by the Supreme Court, “it is the</w:t>
+        <w:t xml:space="preserve">, 568 U.S. 23, 36 (2012)</w:t>
+      </w:r>
+      <w:r>
+        <w:t xml:space="preserve">, both the duration and frequency of flooding remain critical factors. As long-established by the Supreme Court, “it is the</w:t>
       </w:r>
       <w:r>
         <w:t xml:space="preserve"> </w:t>
@@ -1820,7 +1757,13 @@
         <w:t xml:space="preserve">United States v. Cress</w:t>
       </w:r>
       <w:r>
-        <w:t xml:space="preserve">, 243 U.S. 316, 328 (1917) (emphasis added). Isolated flooding events “do not make a taking.”</w:t>
+        <w:t xml:space="preserve">, 243 U.S. 316, 328 (1917)</w:t>
+      </w:r>
+      <w:r>
+        <w:t xml:space="preserve"> </w:t>
+      </w:r>
+      <w:r>
+        <w:t xml:space="preserve">(emphasis added). Isolated flooding events “do not make a taking.”</w:t>
       </w:r>
       <w:r>
         <w:t xml:space="preserve"> </w:t>
@@ -1833,7 +1776,10 @@
         <w:t xml:space="preserve">Ridgeline, Inc. v. United States</w:t>
       </w:r>
       <w:r>
-        <w:t xml:space="preserve">, 346 F.3d 1346, 1357 (Fed. Cir. 2003);</w:t>
+        <w:t xml:space="preserve">, 346 F.3d 1346, 1357 (Fed. Cir. 2003)</w:t>
+      </w:r>
+      <w:r>
+        <w:t xml:space="preserve">;</w:t>
       </w:r>
       <w:r>
         <w:t xml:space="preserve"> </w:t>
@@ -1846,7 +1792,10 @@
         <w:t xml:space="preserve">Baird v. United States</w:t>
       </w:r>
       <w:r>
-        <w:t xml:space="preserve">, 5 Ct. Cl. 324, 329 (1984);</w:t>
+        <w:t xml:space="preserve">, 5 Ct. Cl. 324, 329 (1984)</w:t>
+      </w:r>
+      <w:r>
+        <w:t xml:space="preserve">;</w:t>
       </w:r>
       <w:r>
         <w:t xml:space="preserve"> </w:t>
@@ -1859,7 +1808,10 @@
         <w:t xml:space="preserve">Hartwig v. United States</w:t>
       </w:r>
       <w:r>
-        <w:t xml:space="preserve">, 202 Ct. Cl. 801, 809 (1973).</w:t>
+        <w:t xml:space="preserve">, 202 Ct. Cl. 801, 809 (1973)</w:t>
+      </w:r>
+      <w:r>
+        <w:t xml:space="preserve">.</w:t>
       </w:r>
     </w:p>
     <w:p>
@@ -1872,7 +1824,7 @@
     </w:p>
     <w:p>
       <w:pPr>
-        <w:pStyle w:val="BodyText"/>
+        <w:pStyle w:val="CABodyKeep"/>
       </w:pPr>
       <w:r>
         <w:t xml:space="preserve">For the reasons described above, the record will not sustain the Plaintiffs-Appellants’ Michigan “inverse condemnation” claim or Fifth Amendment “taking” claim against either Midland County or Gladwin County. Summary judgment in favor of the counties should be affirmed.</w:t>
@@ -1969,7 +1921,7 @@
         <w:pStyle w:val="CAKeep"/>
       </w:pPr>
       <w:r>
-        <w:t xml:space="preserve">I certify that this brief complies with the type-volume limitation of Fed. R. App. P. 32(a)(7)(B)(i). Exclusive of the items exempted by Fed. R. App. P. 32(f), the brief contains 1,199 words.</w:t>
+        <w:t xml:space="preserve">I certify that this brief complies with the type-volume limitation of Fed. R. App. P. 32(a)(7)(B)(i). Exclusive of the items exempted by Fed. R. App. P. 32(f), the brief contains 1,146 words.</w:t>
       </w:r>
     </w:p>
     <w:p>
@@ -1977,7 +1929,7 @@
         <w:pStyle w:val="CAKeep"/>
       </w:pPr>
       <w:r>
-        <w:t xml:space="preserve">The brief has been prepared in a proportionally spaced typeface, EB Garamond in 14-point type, which complies with Fed. R. App. P. 32(a)(5) and (6).</w:t>
+        <w:t xml:space="preserve">The brief has been prepared in a proportionally spaced typeface, TeX Gyre Schola in 14-point type, which complies with Fed. R. App. P. 32(a)(5) and (6).</w:t>
       </w:r>
     </w:p>
     <w:p>
@@ -2137,7 +2089,7 @@
       </w:r>
     </w:p>
     <w:sectPr>
-      <w:footerReference w:type="default" r:id="rIdFtr1"/>
+      <w:footerReference w:type="default" r:id="rIdFtrPage"/>
       <w:pgSz w:w="12240" w:h="15840"/>
       <w:pgMar w:top="1440" w:right="1440" w:bottom="1440" w:left="1440" w:header="720" w:footer="720" w:gutter="0"/>
       <w:pgNumType w:fmt="decimal" w:start="1"/>
@@ -2150,49 +2102,34 @@
 <w:comments xmlns:w="http://schemas.openxmlformats.org/wordprocessingml/2006/main" xmlns:m="http://schemas.openxmlformats.org/officeDocument/2006/math" xmlns:r="http://schemas.openxmlformats.org/officeDocument/2006/relationships" xmlns:o="urn:schemas-microsoft-com:office:office" xmlns:v="urn:schemas-microsoft-com:vml" xmlns:w10="urn:schemas-microsoft-com:office:word" xmlns:a="http://schemas.openxmlformats.org/drawingml/2006/main" xmlns:pic="http://schemas.openxmlformats.org/drawingml/2006/picture" xmlns:wp="http://schemas.openxmlformats.org/drawingml/2006/wordprocessingDrawing"/>
 </file>
 
-<file path=word/footer0.xml><?xml version="1.0" encoding="utf-8"?>
-<w:ftr xmlns:w="http://schemas.openxmlformats.org/wordprocessingml/2006/main">
-  <w:p>
-    <w:pPr>
-      <w:pStyle w:val="Footer"/>
-    </w:pPr>
-  </w:p>
-</w:ftr>
+<file path=word/footnotes.xml><?xml version="1.0" encoding="utf-8"?>
+<w:footnotes xmlns:w="http://schemas.openxmlformats.org/wordprocessingml/2006/main" xmlns:m="http://schemas.openxmlformats.org/officeDocument/2006/math" xmlns:r="http://schemas.openxmlformats.org/officeDocument/2006/relationships" xmlns:o="urn:schemas-microsoft-com:office:office" xmlns:v="urn:schemas-microsoft-com:vml" xmlns:w10="urn:schemas-microsoft-com:office:word" xmlns:a="http://schemas.openxmlformats.org/drawingml/2006/main" xmlns:pic="http://schemas.openxmlformats.org/drawingml/2006/picture" xmlns:wp="http://schemas.openxmlformats.org/drawingml/2006/wordprocessingDrawing">
+  <w:footnote w:type="continuationSeparator" w:id="0">
+    <w:p>
+      <w:r>
+        <w:continuationSeparator/>
+      </w:r>
+    </w:p>
+  </w:footnote>
+  <w:footnote w:type="separator" w:id="-1">
+    <w:p>
+      <w:r>
+        <w:separator/>
+      </w:r>
+    </w:p>
+  </w:footnote>
+</w:footnotes>
 </file>
 
-<file path=word/footer1.xml><?xml version="1.0" encoding="utf-8"?>
-<w:ftr xmlns:w="http://schemas.openxmlformats.org/wordprocessingml/2006/main">
+<file path=word/ftr-add.xml><?xml version="1.0" encoding="utf-8"?>
+<w:ftr xmlns:w="http://schemas.openxmlformats.org/wordprocessingml/2006/main" xmlns:r="http://schemas.openxmlformats.org/officeDocument/2006/relationships">
   <w:p>
     <w:pPr>
-      <w:pStyle w:val="Footer"/>
+      <w:spacing w:before="0" w:after="0"/>
+      <w:jc w:val="center"/>
     </w:pPr>
     <w:r>
-      <w:fldChar w:fldCharType="begin"/>
-    </w:r>
-    <w:r>
-      <w:instrText xml:space="preserve"> PAGE </w:instrText>
-    </w:r>
-    <w:r>
-      <w:fldChar w:fldCharType="separate"/>
-    </w:r>
-    <w:r>
-      <w:t>1</w:t>
-    </w:r>
-    <w:r>
-      <w:fldChar w:fldCharType="end"/>
-    </w:r>
-  </w:p>
-</w:ftr>
-</file>
-
-<file path=word/footer2.xml><?xml version="1.0" encoding="utf-8"?>
-<w:ftr xmlns:w="http://schemas.openxmlformats.org/wordprocessingml/2006/main">
-  <w:p>
-    <w:pPr>
-      <w:pStyle w:val="Footer"/>
-    </w:pPr>
-    <w:r>
-      <w:t xml:space="preserve">Add-</w:t>
+      <w:t>Add-</w:t>
     </w:r>
     <w:r>
       <w:fldChar w:fldCharType="begin"/>
@@ -2213,23 +2150,41 @@
 </w:ftr>
 </file>
 
-<file path=word/footnotes.xml><?xml version="1.0" encoding="utf-8"?>
-<w:footnotes xmlns:w="http://schemas.openxmlformats.org/wordprocessingml/2006/main" xmlns:m="http://schemas.openxmlformats.org/officeDocument/2006/math" xmlns:r="http://schemas.openxmlformats.org/officeDocument/2006/relationships" xmlns:o="urn:schemas-microsoft-com:office:office" xmlns:v="urn:schemas-microsoft-com:vml" xmlns:w10="urn:schemas-microsoft-com:office:word" xmlns:a="http://schemas.openxmlformats.org/drawingml/2006/main" xmlns:pic="http://schemas.openxmlformats.org/drawingml/2006/picture" xmlns:wp="http://schemas.openxmlformats.org/drawingml/2006/wordprocessingDrawing">
-  <w:footnote w:type="continuationSeparator" w:id="0">
-    <w:p>
-      <w:r>
-        <w:continuationSeparator/>
-      </w:r>
-    </w:p>
-  </w:footnote>
-  <w:footnote w:type="separator" w:id="-1">
-    <w:p>
-      <w:r>
-        <w:separator/>
-      </w:r>
-    </w:p>
-  </w:footnote>
-</w:footnotes>
+<file path=word/ftr-none.xml><?xml version="1.0" encoding="utf-8"?>
+<w:ftr xmlns:w="http://schemas.openxmlformats.org/wordprocessingml/2006/main" xmlns:r="http://schemas.openxmlformats.org/officeDocument/2006/relationships">
+  <w:p>
+    <w:pPr>
+      <w:spacing w:before="0" w:after="0"/>
+      <w:jc w:val="center"/>
+    </w:pPr>
+  </w:p>
+</w:ftr>
+</file>
+
+<file path=word/ftr-page.xml><?xml version="1.0" encoding="utf-8"?>
+<w:ftr xmlns:w="http://schemas.openxmlformats.org/wordprocessingml/2006/main" xmlns:r="http://schemas.openxmlformats.org/officeDocument/2006/relationships">
+  <w:p>
+    <w:pPr>
+      <w:spacing w:before="0" w:after="0"/>
+      <w:jc w:val="center"/>
+    </w:pPr>
+    <w:r>
+      <w:fldChar w:fldCharType="begin"/>
+    </w:r>
+    <w:r>
+      <w:instrText xml:space="preserve"> PAGE </w:instrText>
+    </w:r>
+    <w:r>
+      <w:fldChar w:fldCharType="separate"/>
+    </w:r>
+    <w:r>
+      <w:t>1</w:t>
+    </w:r>
+    <w:r>
+      <w:fldChar w:fldCharType="end"/>
+    </w:r>
+  </w:p>
+</w:ftr>
 </file>
 
 <file path=word/numbering.xml><?xml version="1.0" encoding="utf-8"?>
@@ -2432,11 +2387,11 @@
 </file>
 
 <file path=word/styles.xml><?xml version="1.0" encoding="utf-8"?>
-<w:styles xmlns:w="http://schemas.openxmlformats.org/wordprocessingml/2006/main">
+<w:styles xmlns:w="http://schemas.openxmlformats.org/wordprocessingml/2006/main" xmlns:r="http://schemas.openxmlformats.org/officeDocument/2006/relationships">
   <w:docDefaults>
     <w:rPrDefault>
       <w:rPr>
-        <w:rFonts w:ascii="EB Garamond" w:hAnsi="EB Garamond" w:eastAsia="EB Garamond" w:cs="EB Garamond"/>
+        <w:rFonts w:ascii="TeX Gyre Schola" w:hAnsi="TeX Gyre Schola" w:eastAsia="TeX Gyre Schola" w:cs="TeX Gyre Schola"/>
         <w:sz w:val="28"/>
         <w:szCs w:val="28"/>
         <w:lang w:val="en-US" w:eastAsia="en-US" w:bidi="ar-SA"/>
@@ -2452,7 +2407,7 @@
     <w:name w:val="Normal"/>
     <w:qFormat/>
     <w:pPr>
-      <w:spacing w:before="0" w:after="0" w:line="399" w:lineRule="exact"/>
+      <w:spacing w:before="0" w:after="0" w:line="407" w:lineRule="exact"/>
     </w:pPr>
   </w:style>
   <w:style w:type="character" w:default="1" w:styleId="DefaultParagraphFont">
@@ -2499,7 +2454,7 @@
     <w:basedOn w:val="Normal"/>
     <w:qFormat/>
     <w:pPr>
-      <w:spacing w:before="0" w:after="0" w:line="629" w:lineRule="exact"/>
+      <w:spacing w:before="0" w:after="0" w:line="637" w:lineRule="exact"/>
       <w:ind w:firstLine="720"/>
     </w:pPr>
   </w:style>
@@ -2514,7 +2469,7 @@
     <w:basedOn w:val="Normal"/>
     <w:qFormat/>
     <w:pPr>
-      <w:spacing w:before="0" w:after="0" w:line="399" w:lineRule="exact"/>
+      <w:spacing w:before="0" w:after="0" w:line="407" w:lineRule="exact"/>
       <w:ind w:firstLine="0"/>
     </w:pPr>
   </w:style>
@@ -2522,7 +2477,7 @@
     <w:name w:val="Footnote Text"/>
     <w:basedOn w:val="Normal"/>
     <w:pPr>
-      <w:spacing w:before="0" w:after="140" w:line="399" w:lineRule="exact"/>
+      <w:spacing w:before="0" w:after="140" w:line="407" w:lineRule="exact"/>
       <w:ind w:firstLine="0"/>
     </w:pPr>
     <w:rPr>
@@ -2540,7 +2495,7 @@
     <w:name w:val="footer"/>
     <w:basedOn w:val="Normal"/>
     <w:pPr>
-      <w:spacing w:line="399" w:lineRule="exact"/>
+      <w:spacing w:line="407" w:lineRule="exact"/>
       <w:jc w:val="center"/>
     </w:pPr>
   </w:style>
@@ -2552,7 +2507,7 @@
     <w:pPr>
       <w:keepNext/>
       <w:keepLines/>
-      <w:spacing w:before="420" w:after="308" w:line="399" w:lineRule="exact"/>
+      <w:spacing w:before="200" w:after="0" w:line="466" w:lineRule="exact"/>
       <w:ind w:firstLine="0"/>
       <w:jc w:val="center"/>
       <w:outlineLvl w:val="0"/>
@@ -2580,7 +2535,7 @@
     <w:pPr>
       <w:keepNext/>
       <w:keepLines/>
-      <w:spacing w:before="336" w:after="280" w:line="399" w:lineRule="exact"/>
+      <w:spacing w:before="336" w:after="0" w:line="407" w:lineRule="exact"/>
       <w:ind w:firstLine="0"/>
       <w:jc w:val="center"/>
       <w:outlineLvl w:val="1"/>
@@ -2601,8 +2556,8 @@
       </w:tabs>
       <w:keepNext/>
       <w:keepLines/>
-      <w:spacing w:before="308" w:after="252" w:line="399" w:lineRule="exact"/>
-      <w:ind w:left="1440" w:hanging="720" w:firstLine="0"/>
+      <w:spacing w:before="308" w:after="0" w:line="407" w:lineRule="exact"/>
+      <w:ind w:left="1440" w:hanging="720"/>
       <w:outlineLvl w:val="2"/>
     </w:pPr>
     <w:rPr>
@@ -2618,7 +2573,7 @@
       <w:tabs>
         <w:tab w:val="left" w:pos="2161"/>
       </w:tabs>
-      <w:ind w:left="2160" w:hanging="720" w:firstLine="0"/>
+      <w:ind w:left="2160" w:hanging="720"/>
       <w:outlineLvl w:val="3"/>
     </w:pPr>
   </w:style>
@@ -2630,7 +2585,7 @@
       <w:tabs>
         <w:tab w:val="left" w:pos="2881"/>
       </w:tabs>
-      <w:ind w:left="2880" w:hanging="720" w:firstLine="0"/>
+      <w:ind w:left="2880" w:hanging="720"/>
       <w:outlineLvl w:val="4"/>
     </w:pPr>
   </w:style>
@@ -2642,7 +2597,7 @@
       <w:tabs>
         <w:tab w:val="left" w:pos="3601"/>
       </w:tabs>
-      <w:ind w:left="3600" w:hanging="720" w:firstLine="0"/>
+      <w:ind w:left="3600" w:hanging="720"/>
       <w:outlineLvl w:val="5"/>
     </w:pPr>
   </w:style>
@@ -2653,7 +2608,7 @@
     <w:pPr>
       <w:keepNext/>
       <w:keepLines/>
-      <w:spacing w:before="336" w:after="252" w:line="399" w:lineRule="exact"/>
+      <w:spacing w:before="336" w:after="0" w:line="407" w:lineRule="exact"/>
       <w:ind w:firstLine="0"/>
       <w:outlineLvl w:val="1"/>
     </w:pPr>
@@ -2673,7 +2628,7 @@
     <w:name w:val="CA Single"/>
     <w:basedOn w:val="Normal"/>
     <w:pPr>
-      <w:spacing w:before="0" w:after="280" w:line="399" w:lineRule="exact"/>
+      <w:spacing w:before="0" w:after="280" w:line="407" w:lineRule="exact"/>
       <w:ind w:firstLine="0"/>
     </w:pPr>
   </w:style>
@@ -2681,7 +2636,7 @@
     <w:name w:val="CA Cover"/>
     <w:basedOn w:val="Normal"/>
     <w:pPr>
-      <w:spacing w:before="10" w:after="10" w:line="399" w:lineRule="exact"/>
+      <w:spacing w:before="0" w:after="0" w:line="380" w:lineRule="exact"/>
       <w:ind w:firstLine="0"/>
       <w:jc w:val="center"/>
     </w:pPr>
@@ -2698,7 +2653,7 @@
     <w:name w:val="CA Cover Left"/>
     <w:basedOn w:val="CACover"/>
     <w:pPr>
-      <w:spacing w:before="0" w:after="0" w:line="399" w:lineRule="exact"/>
+      <w:spacing w:before="0" w:after="0" w:line="380" w:lineRule="exact"/>
       <w:ind w:left="4680" w:firstLine="0"/>
       <w:jc w:val="left"/>
     </w:pPr>
@@ -2753,7 +2708,7 @@
       <w:pBdr>
         <w:bottom w:val="single" w:sz="6" w:space="0" w:color="000000"/>
       </w:pBdr>
-      <w:spacing w:before="0" w:after="100" w:line="200" w:lineRule="exact"/>
+      <w:spacing w:before="0" w:after="60" w:line="200" w:lineRule="exact"/>
       <w:ind w:left="3240" w:right="3240" w:firstLine="0"/>
     </w:pPr>
     <w:rPr>
@@ -2774,7 +2729,7 @@
     <w:name w:val="CA Signature Gap"/>
     <w:basedOn w:val="CASig"/>
     <w:pPr>
-      <w:spacing w:before="392" w:after="0" w:line="399" w:lineRule="exact"/>
+      <w:spacing w:before="392" w:after="0" w:line="407" w:lineRule="exact"/>
     </w:pPr>
   </w:style>
   <w:style w:type="paragraph" w:customStyle="1" w:styleId="CASignatureLine">
@@ -2804,7 +2759,7 @@
       <w:tabs>
         <w:tab w:val="left" w:pos="4680"/>
       </w:tabs>
-      <w:spacing w:before="280" w:after="0" w:line="399" w:lineRule="exact"/>
+      <w:spacing w:before="280" w:after="0" w:line="407" w:lineRule="exact"/>
       <w:ind w:firstLine="0"/>
     </w:pPr>
   </w:style>
@@ -2819,7 +2774,7 @@
     <w:name w:val="CA TOC Page"/>
     <w:basedOn w:val="Normal"/>
     <w:pPr>
-      <w:spacing w:before="0" w:after="0" w:line="399" w:lineRule="exact"/>
+      <w:spacing w:before="0" w:after="0" w:line="407" w:lineRule="exact"/>
       <w:ind w:firstLine="0"/>
       <w:jc w:val="right"/>
     </w:pPr>
@@ -2836,8 +2791,8 @@
       <w:tabs>
         <w:tab w:val="right" w:leader="dot" w:pos="9245"/>
       </w:tabs>
-      <w:spacing w:before="84" w:after="0" w:line="399" w:lineRule="exact"/>
-      <w:ind w:left="0" w:firstLine="0"/>
+      <w:spacing w:before="84" w:after="0" w:line="407" w:lineRule="exact"/>
+      <w:ind w:left="0" w:right="576" w:firstLine="0"/>
     </w:pPr>
   </w:style>
   <w:style w:type="paragraph" w:customStyle="1" w:styleId="CATOCText0">
@@ -2847,8 +2802,8 @@
       <w:tabs>
         <w:tab w:val="right" w:leader="dot" w:pos="8525"/>
       </w:tabs>
-      <w:spacing w:before="0" w:after="0" w:line="399" w:lineRule="exact"/>
-      <w:ind w:left="0" w:firstLine="0"/>
+      <w:spacing w:before="0" w:after="0" w:line="407" w:lineRule="exact"/>
+      <w:ind w:left="0" w:right="576" w:firstLine="0"/>
     </w:pPr>
   </w:style>
   <w:style w:type="paragraph" w:customStyle="1" w:styleId="CATOCText1">
@@ -2858,8 +2813,8 @@
       <w:tabs>
         <w:tab w:val="right" w:leader="dot" w:pos="7805"/>
       </w:tabs>
-      <w:spacing w:before="0" w:after="0" w:line="399" w:lineRule="exact"/>
-      <w:ind w:left="0" w:firstLine="0"/>
+      <w:spacing w:before="0" w:after="0" w:line="407" w:lineRule="exact"/>
+      <w:ind w:left="0" w:right="576" w:firstLine="0"/>
     </w:pPr>
   </w:style>
   <w:style w:type="paragraph" w:customStyle="1" w:styleId="CATOCText2">
@@ -2869,8 +2824,8 @@
       <w:tabs>
         <w:tab w:val="right" w:leader="dot" w:pos="7085"/>
       </w:tabs>
-      <w:spacing w:before="0" w:after="0" w:line="399" w:lineRule="exact"/>
-      <w:ind w:left="0" w:firstLine="0"/>
+      <w:spacing w:before="0" w:after="0" w:line="407" w:lineRule="exact"/>
+      <w:ind w:left="0" w:right="576" w:firstLine="0"/>
     </w:pPr>
   </w:style>
   <w:style w:type="paragraph" w:customStyle="1" w:styleId="CATOCText3">
@@ -2880,15 +2835,15 @@
       <w:tabs>
         <w:tab w:val="right" w:leader="dot" w:pos="6365"/>
       </w:tabs>
-      <w:spacing w:before="0" w:after="0" w:line="399" w:lineRule="exact"/>
-      <w:ind w:left="0" w:firstLine="0"/>
+      <w:spacing w:before="0" w:after="0" w:line="407" w:lineRule="exact"/>
+      <w:ind w:left="0" w:right="576" w:firstLine="0"/>
     </w:pPr>
   </w:style>
   <w:style w:type="paragraph" w:customStyle="1" w:styleId="CATOCLabel0">
     <w:name w:val="CA TOC Label 0"/>
     <w:basedOn w:val="Normal"/>
     <w:pPr>
-      <w:spacing w:before="0" w:after="0" w:line="399" w:lineRule="exact"/>
+      <w:spacing w:before="0" w:after="0" w:line="407" w:lineRule="exact"/>
       <w:ind w:left="0" w:firstLine="0"/>
     </w:pPr>
   </w:style>
@@ -2896,7 +2851,7 @@
     <w:name w:val="CA TOC Label 1"/>
     <w:basedOn w:val="Normal"/>
     <w:pPr>
-      <w:spacing w:before="0" w:after="0" w:line="399" w:lineRule="exact"/>
+      <w:spacing w:before="0" w:after="0" w:line="407" w:lineRule="exact"/>
       <w:ind w:left="720" w:firstLine="0"/>
     </w:pPr>
   </w:style>
@@ -2904,7 +2859,7 @@
     <w:name w:val="CA TOC Label 2"/>
     <w:basedOn w:val="Normal"/>
     <w:pPr>
-      <w:spacing w:before="0" w:after="0" w:line="399" w:lineRule="exact"/>
+      <w:spacing w:before="0" w:after="0" w:line="407" w:lineRule="exact"/>
       <w:ind w:left="1440" w:firstLine="0"/>
     </w:pPr>
   </w:style>
@@ -2912,7 +2867,7 @@
     <w:name w:val="CA TOC Label 3"/>
     <w:basedOn w:val="Normal"/>
     <w:pPr>
-      <w:spacing w:before="0" w:after="0" w:line="399" w:lineRule="exact"/>
+      <w:spacing w:before="0" w:after="0" w:line="407" w:lineRule="exact"/>
       <w:ind w:left="2160" w:firstLine="0"/>
     </w:pPr>
   </w:style>
@@ -2924,7 +2879,7 @@
       <w:tabs>
         <w:tab w:val="right" w:pos="9360"/>
       </w:tabs>
-      <w:spacing w:before="280" w:after="60" w:line="399" w:lineRule="exact"/>
+      <w:spacing w:before="280" w:after="60" w:line="407" w:lineRule="exact"/>
       <w:ind w:firstLine="0"/>
     </w:pPr>
     <w:rPr>
@@ -2940,15 +2895,15 @@
       <w:tabs>
         <w:tab w:val="right" w:leader="dot" w:pos="9360"/>
       </w:tabs>
-      <w:spacing w:before="140" w:after="0" w:line="399" w:lineRule="exact"/>
-      <w:ind w:left="504" w:hanging="504" w:firstLine="0"/>
+      <w:spacing w:before="140" w:after="0" w:line="407" w:lineRule="exact"/>
+      <w:ind w:left="504" w:right="576" w:hanging="504"/>
     </w:pPr>
   </w:style>
   <w:style w:type="paragraph" w:customStyle="1" w:styleId="CATable">
     <w:name w:val="CA Table Text"/>
     <w:basedOn w:val="Compact"/>
     <w:pPr>
-      <w:spacing w:before="0" w:after="0" w:line="399" w:lineRule="exact"/>
+      <w:spacing w:before="0" w:after="0" w:line="407" w:lineRule="exact"/>
       <w:ind w:firstLine="0"/>
       <w:jc w:val="left"/>
     </w:pPr>
@@ -2979,7 +2934,7 @@
     <w:pPr>
       <w:keepNext/>
       <w:keepLines/>
-      <w:spacing w:before="336" w:after="0" w:line="399" w:lineRule="exact"/>
+      <w:spacing w:before="336" w:after="0" w:line="407" w:lineRule="exact"/>
       <w:ind w:left="0" w:firstLine="0"/>
     </w:pPr>
   </w:style>
@@ -2987,7 +2942,7 @@
     <w:name w:val="CA Cert Signature Line"/>
     <w:basedOn w:val="CACertSig"/>
     <w:pPr>
-      <w:spacing w:before="0" w:after="0" w:line="399" w:lineRule="exact"/>
+      <w:spacing w:before="0" w:after="0" w:line="407" w:lineRule="exact"/>
       <w:ind w:left="140" w:firstLine="0"/>
     </w:pPr>
     <w:rPr>
@@ -2999,7 +2954,7 @@
     <w:name w:val="CA Date"/>
     <w:basedOn w:val="Normal"/>
     <w:pPr>
-      <w:spacing w:before="224" w:after="0" w:line="399" w:lineRule="exact"/>
+      <w:spacing w:before="224" w:after="0" w:line="407" w:lineRule="exact"/>
       <w:ind w:left="0" w:firstLine="0"/>
     </w:pPr>
   </w:style>
@@ -3009,7 +2964,7 @@
     <w:pPr>
       <w:keepNext/>
       <w:keepLines/>
-      <w:spacing w:before="160" w:after="0" w:line="399" w:lineRule="exact"/>
+      <w:spacing w:before="160" w:after="0" w:line="407" w:lineRule="exact"/>
       <w:ind w:left="720" w:firstLine="0"/>
     </w:pPr>
   </w:style>
@@ -3018,7 +2973,7 @@
     <w:basedOn w:val="CASingle"/>
     <w:pPr>
       <w:keepNext/>
-      <w:spacing w:before="0" w:after="280" w:line="399" w:lineRule="exact"/>
+      <w:spacing w:before="0" w:after="280" w:line="407" w:lineRule="exact"/>
       <w:ind w:firstLine="0"/>
       <w:jc w:val="center"/>
     </w:pPr>
@@ -3035,15 +2990,15 @@
       <w:tabs>
         <w:tab w:val="left" w:pos="448"/>
       </w:tabs>
-      <w:spacing w:before="280" w:after="0" w:line="399" w:lineRule="exact"/>
-      <w:ind w:left="448" w:hanging="448" w:firstLine="0"/>
+      <w:spacing w:before="280" w:after="0" w:line="407" w:lineRule="exact"/>
+      <w:ind w:left="448" w:hanging="448"/>
     </w:pPr>
   </w:style>
   <w:style w:type="paragraph" w:customStyle="1" w:styleId="CADisclosureAnswer">
     <w:name w:val="CA Disclosure Answer"/>
     <w:basedOn w:val="CASingle"/>
     <w:pPr>
-      <w:spacing w:before="0" w:after="0" w:line="399" w:lineRule="exact"/>
+      <w:spacing w:before="0" w:after="0" w:line="407" w:lineRule="exact"/>
       <w:ind w:left="448" w:firstLine="0"/>
     </w:pPr>
   </w:style>
@@ -3339,7 +3294,7 @@
     </a:clrScheme>
     <a:fontScheme name="Office">
       <a:majorFont>
-        <a:latin typeface="Aptos Display" panose="02110004020202020204"/>
+        <a:latin typeface="TeX Gyre Schola" panose="02110004020202020204"/>
         <a:ea typeface=""/>
         <a:cs typeface=""/>
         <a:font script="Jpan" typeface="游ゴシック Light"/>
@@ -3391,7 +3346,7 @@
         <a:font script="Tfng" typeface="Ebrima"/>
       </a:majorFont>
       <a:minorFont>
-        <a:latin typeface="Aptos" panose="02110004020202020204"/>
+        <a:latin typeface="TeX Gyre Schola" panose="02110004020202020204"/>
         <a:ea typeface=""/>
         <a:cs typeface=""/>
         <a:font script="Jpan" typeface="游明朝"/>

</xml_diff>